<commit_message>
Coherence: canonical batch-1 think latency (~11s) everywhere; fix stale title/numbers; regen all artifacts
- Resolved think-latency methodology: batch-1-native (~11s, master_data.csv) is canonical across paper/
  overview/HTML/README/CLAUDE/RESULTS; rt_cascade (~28s, 20.0->5.7) flagged superseded via METHOD_ACC banner.
- Fixed paper §4 T2 26.6s->11.3s, abstract/intro ~28->~11s, c_T2 80x->33x; old paper-title ref in overview.
- Regenerated IEEE PDF, paper docx, overview docx, professor HTML. Final sweep: no stale tokens; all
  headline numbers (11.34->2.27, 0.501, 0.924, 0.232) consistent across deliverables.

Co-Authored-By: Claude Opus 4.8 <noreply@anthropic.com>
Claude-Session: https://claude.ai/code/session_01Q8J4SpG8WQbTwXXZJxqG8U
</commit_message>
<xml_diff>
--- a/docx/PROJECT_OVERVIEW.docx
+++ b/docx/PROJECT_OVERVIEW.docx
@@ -111,7 +111,7 @@
         <w:t>accurate but slow and power-hungry</w:t>
       </w:r>
       <w:r>
-        <w:t xml:space="preserve"> (a 32-billion-parameter model takes ~28 seconds and ~6 kilojoules per</w:t>
+        <w:t xml:space="preserve"> (a 32-billion-parameter model takes ~11 seconds and ~6 kilojoules per</w:t>
       </w:r>
     </w:p>
     <w:p>
@@ -1221,7 +1221,16 @@
     </w:p>
     <w:p>
       <w:r>
-        <w:t>tier. The title of the paper reflects this: "It's the compute configuration, not the gate."</w:t>
+        <w:t xml:space="preserve">tier. The paper's thesis: the </w:t>
+      </w:r>
+      <w:r>
+        <w:rPr>
+          <w:i/>
+        </w:rPr>
+        <w:t>structure</w:t>
+      </w:r>
+      <w:r>
+        <w:t xml:space="preserve"> (the fast middle tier), not the gate, is the win.</w:t>
       </w:r>
     </w:p>
     <w:p>

</xml_diff>

<commit_message>
CRITICAL honesty correction: verifier MATCHES the 32B (seed-dependent), not 'beats'
2-seed result: seed0 verifier 0.501 vs 32B 0.462 (+0.039, sig); seed1 verifier 0.445 vs 32B 0.450 (tie).
Reconstructed seed1 split (validated: seed0 32B=0.462 exact). So 'beats the 32B' was seed-0 cherry-pick ->
reframed to 'matches/competitive with the 32B' everywhere (report 11 edits, paper .md/.tex, overview).
ROBUST claim kept: verifier decisively beats training-free selection (+0.07-0.09 over greedy, both seeds);
helps hard sets (PathVQA/Kvasir) on both seeds; gap-captured 35-49% (was single-seed 49%). VERIFIED_FACTS §I.

Co-Authored-By: Claude Opus 4.8 <noreply@anthropic.com>
Claude-Session: https://claude.ai/code/session_01Q8J4SpG8WQbTwXXZJxqG8U
</commit_message>
<xml_diff>
--- a/docx/PROJECT_OVERVIEW.docx
+++ b/docx/PROJECT_OVERVIEW.docx
@@ -1505,10 +1505,10 @@
         <w:rPr>
           <w:b/>
         </w:rPr>
-        <w:t>49%</w:t>
+        <w:t>35–49%</w:t>
       </w:r>
       <w:r>
-        <w:t xml:space="preserve"> of the oracle gap (averaged over 4 datasets,</w:t>
+        <w:t xml:space="preserve"> of the oracle gap (two seeds; seed-0 table below averaged over 4 datasets,</w:t>
       </w:r>
     </w:p>
     <w:p>
@@ -2183,7 +2183,16 @@
         <w:t>untrained</w:t>
       </w:r>
       <w:r>
-        <w:t xml:space="preserve"> version, and even beats the </w:t>
+        <w:t xml:space="preserve"> version, and </w:t>
+      </w:r>
+      <w:r>
+        <w:rPr>
+          <w:b/>
+        </w:rPr>
+        <w:t>matches</w:t>
+      </w:r>
+      <w:r>
+        <w:t xml:space="preserve"> the </w:t>
       </w:r>
       <w:r>
         <w:rPr>
@@ -2192,7 +2201,7 @@
         <w:t>5× bigger 32B model's</w:t>
       </w:r>
       <w:r>
-        <w:t xml:space="preserve"> answer.</w:t>
+        <w:t xml:space="preserve"> answer (a significant win on one split, a tie on another).</w:t>
       </w:r>
     </w:p>
     <w:p>
@@ -2249,12 +2258,21 @@
         <w:t>with the verifier</w:t>
       </w:r>
       <w:r>
-        <w:t xml:space="preserve"> (0.501) beats the big 32B's single</w:t>
+        <w:t xml:space="preserve"> (0.501) </w:t>
+      </w:r>
+      <w:r>
+        <w:rPr>
+          <w:b/>
+        </w:rPr>
+        <w:t>matches</w:t>
+      </w:r>
+      <w:r>
+        <w:t xml:space="preserve"> the big 32B's single</w:t>
       </w:r>
     </w:p>
     <w:p>
       <w:r>
-        <w:t xml:space="preserve">  answer (0.462, same questions) — because, for these questions, thinking bigger barely helps but </w:t>
+        <w:t xml:space="preserve">  answer (0.462, same questions; a tie on a 2nd seed) — because, for these questions, thinking bigger barely helps but </w:t>
       </w:r>
       <w:r>
         <w:rPr>
@@ -2606,7 +2624,7 @@
     </w:p>
     <w:p>
       <w:r>
-        <w:t xml:space="preserve">  trained verifier (accuracy: 40–78% of the oracle gap, answers </w:t>
+        <w:t xml:space="preserve">  trained verifier (accuracy: 35–78% of the oracle gap across two seeds, answers </w:t>
       </w:r>
       <w:r>
         <w:rPr>

</xml_diff>